<commit_message>
Update, docs singleton - semana 3
</commit_message>
<xml_diff>
--- a/DOCUMENTACIÓN - ENTREGABLES/Patron Singleton - Semana 3.docx
+++ b/DOCUMENTACIÓN - ENTREGABLES/Patron Singleton - Semana 3.docx
@@ -1534,6 +1534,7 @@
       <w:pPr>
         <w:pStyle w:val="5"/>
         <w:numPr>
+          <w:ilvl w:val="0"/>
           <w:numId w:val="0"/>
         </w:numPr>
         <w:ind w:left="360" w:leftChars="0"/>
@@ -1557,17 +1558,7 @@
           <w:sz w:val="22"/>
           <w:szCs w:val="22"/>
         </w:rPr>
-        <w:t>Evidencia del patrón Single</w:t>
-      </w:r>
-      <w:bookmarkStart w:id="0" w:name="_GoBack"/>
-      <w:bookmarkEnd w:id="0"/>
-      <w:r>
-        <w:rPr>
-          <w:rFonts w:hint="default" w:ascii="Arial" w:hAnsi="Arial" w:cs="Arial"/>
-          <w:sz w:val="22"/>
-          <w:szCs w:val="22"/>
-        </w:rPr>
-        <w:t>ton — Catálogo de tipos de cuenta</w:t>
+        <w:t>Evidencia del patrón Singleton — Catálogo de tipos de cuenta</w:t>
       </w:r>
     </w:p>
     <w:p>
@@ -1607,6 +1598,7 @@
     <w:p>
       <w:pPr>
         <w:numPr>
+          <w:ilvl w:val="0"/>
           <w:numId w:val="0"/>
         </w:numPr>
         <w:rPr>
@@ -1672,6 +1664,7 @@
     <w:p>
       <w:pPr>
         <w:numPr>
+          <w:ilvl w:val="0"/>
           <w:numId w:val="0"/>
         </w:numPr>
         <w:ind w:leftChars="0"/>
@@ -1711,6 +1704,7 @@
     <w:p>
       <w:pPr>
         <w:numPr>
+          <w:ilvl w:val="0"/>
           <w:numId w:val="0"/>
         </w:numPr>
         <w:ind w:leftChars="0"/>
@@ -4623,6 +4617,140 @@
         </w:drawing>
       </w:r>
     </w:p>
+    <w:p>
+      <w:pPr>
+        <w:numPr>
+          <w:ilvl w:val="0"/>
+          <w:numId w:val="3"/>
+        </w:numPr>
+        <w:jc w:val="left"/>
+        <w:rPr>
+          <w:rFonts w:hint="default" w:ascii="Arial" w:hAnsi="Arial" w:cs="Arial"/>
+          <w:sz w:val="22"/>
+          <w:szCs w:val="22"/>
+          <w:lang w:val="es-CO"/>
+        </w:rPr>
+      </w:pPr>
+      <w:r>
+        <w:rPr>
+          <w:rFonts w:hint="default" w:ascii="Arial" w:hAnsi="Arial" w:cs="Arial"/>
+          <w:sz w:val="22"/>
+          <w:szCs w:val="22"/>
+          <w:lang w:val="es-CO"/>
+        </w:rPr>
+        <w:t>Evidencia en el sistema</w:t>
+      </w:r>
+    </w:p>
+    <w:p>
+      <w:pPr>
+        <w:numPr>
+          <w:numId w:val="0"/>
+        </w:numPr>
+        <w:jc w:val="left"/>
+        <w:rPr>
+          <w:rFonts w:hint="default" w:ascii="Arial" w:hAnsi="Arial" w:cs="Arial"/>
+          <w:sz w:val="22"/>
+          <w:szCs w:val="22"/>
+          <w:lang w:val="es-CO"/>
+        </w:rPr>
+      </w:pPr>
+    </w:p>
+    <w:p>
+      <w:pPr>
+        <w:numPr>
+          <w:numId w:val="0"/>
+        </w:numPr>
+        <w:jc w:val="left"/>
+        <w:rPr>
+          <w:rFonts w:hint="default" w:ascii="Arial" w:hAnsi="Arial" w:cs="Arial"/>
+          <w:sz w:val="22"/>
+          <w:szCs w:val="22"/>
+          <w:lang w:val="es-CO"/>
+        </w:rPr>
+      </w:pPr>
+      <w:r>
+        <w:rPr>
+          <w:rFonts w:hint="default" w:ascii="Arial" w:hAnsi="Arial" w:cs="Arial"/>
+          <w:sz w:val="22"/>
+          <w:szCs w:val="22"/>
+          <w:lang w:val="es-CO"/>
+        </w:rPr>
+        <w:t>Se establecieron dos tipos de cuentas en el catalogo, en el cual se instanciaron desde el controlador y se evidencia en el imagen que al compararlas coinciden en la misma instancia.</w:t>
+      </w:r>
+      <w:bookmarkStart w:id="0" w:name="_GoBack"/>
+      <w:bookmarkEnd w:id="0"/>
+    </w:p>
+    <w:p>
+      <w:pPr>
+        <w:numPr>
+          <w:numId w:val="0"/>
+        </w:numPr>
+        <w:jc w:val="both"/>
+        <w:rPr>
+          <w:rFonts w:hint="default" w:ascii="Arial" w:hAnsi="Arial" w:cs="Arial"/>
+          <w:sz w:val="22"/>
+          <w:szCs w:val="22"/>
+          <w:lang w:val="es-CO"/>
+        </w:rPr>
+      </w:pPr>
+    </w:p>
+    <w:p>
+      <w:pPr>
+        <w:numPr>
+          <w:numId w:val="0"/>
+        </w:numPr>
+        <w:jc w:val="both"/>
+        <w:rPr>
+          <w:rFonts w:hint="default" w:ascii="Arial" w:hAnsi="Arial" w:cs="Arial"/>
+          <w:sz w:val="22"/>
+          <w:szCs w:val="22"/>
+          <w:lang w:val="es-CO"/>
+        </w:rPr>
+      </w:pPr>
+      <w:r>
+        <w:drawing>
+          <wp:inline distT="0" distB="0" distL="114300" distR="114300">
+            <wp:extent cx="6117590" cy="3138805"/>
+            <wp:effectExtent l="0" t="0" r="8890" b="635"/>
+            <wp:docPr id="2" name="Imagen 1"/>
+            <wp:cNvGraphicFramePr>
+              <a:graphicFrameLocks xmlns:a="http://schemas.openxmlformats.org/drawingml/2006/main" noChangeAspect="1"/>
+            </wp:cNvGraphicFramePr>
+            <a:graphic xmlns:a="http://schemas.openxmlformats.org/drawingml/2006/main">
+              <a:graphicData uri="http://schemas.openxmlformats.org/drawingml/2006/picture">
+                <pic:pic xmlns:pic="http://schemas.openxmlformats.org/drawingml/2006/picture">
+                  <pic:nvPicPr>
+                    <pic:cNvPr id="2" name="Imagen 1"/>
+                    <pic:cNvPicPr>
+                      <a:picLocks noChangeAspect="1"/>
+                    </pic:cNvPicPr>
+                  </pic:nvPicPr>
+                  <pic:blipFill>
+                    <a:blip r:embed="rId5"/>
+                    <a:stretch>
+                      <a:fillRect/>
+                    </a:stretch>
+                  </pic:blipFill>
+                  <pic:spPr>
+                    <a:xfrm>
+                      <a:off x="0" y="0"/>
+                      <a:ext cx="6117590" cy="3138805"/>
+                    </a:xfrm>
+                    <a:prstGeom prst="rect">
+                      <a:avLst/>
+                    </a:prstGeom>
+                    <a:noFill/>
+                    <a:ln>
+                      <a:noFill/>
+                    </a:ln>
+                  </pic:spPr>
+                </pic:pic>
+              </a:graphicData>
+            </a:graphic>
+          </wp:inline>
+        </w:drawing>
+      </w:r>
+    </w:p>
     <w:sectPr>
       <w:pgSz w:w="11906" w:h="16838"/>
       <w:pgMar w:top="1134" w:right="1134" w:bottom="1134" w:left="1134" w:header="708" w:footer="708" w:gutter="0"/>
@@ -4759,11 +4887,26 @@
       </w:rPr>
     </w:lvl>
   </w:abstractNum>
+  <w:abstractNum w:abstractNumId="2">
+    <w:nsid w:val="3F5CAFD9"/>
+    <w:multiLevelType w:val="singleLevel"/>
+    <w:tmpl w:val="3F5CAFD9"/>
+    <w:lvl w:ilvl="0" w:tentative="0">
+      <w:start w:val="6"/>
+      <w:numFmt w:val="decimal"/>
+      <w:suff w:val="space"/>
+      <w:lvlText w:val="%1."/>
+      <w:lvlJc w:val="left"/>
+    </w:lvl>
+  </w:abstractNum>
   <w:num w:numId="1">
     <w:abstractNumId w:val="1"/>
   </w:num>
   <w:num w:numId="2">
     <w:abstractNumId w:val="0"/>
+  </w:num>
+  <w:num w:numId="3">
+    <w:abstractNumId w:val="2"/>
   </w:num>
 </w:numbering>
 </file>
@@ -4844,7 +4987,7 @@
     <w:lsdException w:qFormat="1" w:unhideWhenUsed="0" w:uiPriority="0" w:semiHidden="0" w:name="Title"/>
     <w:lsdException w:unhideWhenUsed="0" w:uiPriority="0" w:semiHidden="0" w:name="Closing"/>
     <w:lsdException w:unhideWhenUsed="0" w:uiPriority="0" w:semiHidden="0" w:name="Signature"/>
-    <w:lsdException w:unhideWhenUsed="0" w:uiPriority="0" w:name="Default Paragraph Font"/>
+    <w:lsdException w:qFormat="1" w:unhideWhenUsed="0" w:uiPriority="0" w:name="Default Paragraph Font"/>
     <w:lsdException w:unhideWhenUsed="0" w:uiPriority="0" w:semiHidden="0" w:name="Body Text"/>
     <w:lsdException w:unhideWhenUsed="0" w:uiPriority="0" w:semiHidden="0" w:name="Body Text Indent"/>
     <w:lsdException w:unhideWhenUsed="0" w:uiPriority="0" w:semiHidden="0" w:name="List Continue"/>
@@ -4935,6 +5078,7 @@
     <w:qFormat/>
     <w:uiPriority w:val="0"/>
     <w:rPr>
+      <w:rFonts w:asciiTheme="minorHAnsi" w:hAnsiTheme="minorHAnsi" w:eastAsiaTheme="minorEastAsia" w:cstheme="minorBidi"/>
       <w:sz w:val="21"/>
       <w:szCs w:val="22"/>
     </w:rPr>
@@ -4962,6 +5106,7 @@
   <w:style w:type="character" w:default="1" w:styleId="3">
     <w:name w:val="Default Paragraph Font"/>
     <w:semiHidden/>
+    <w:qFormat/>
     <w:uiPriority w:val="0"/>
   </w:style>
   <w:style w:type="table" w:default="1" w:styleId="4">

</xml_diff>